<commit_message>
Doc: Final Year Project Proposal Form, Added to Section 1,2,3 - Ryan Turner 02/10/2026
</commit_message>
<xml_diff>
--- a/Documents/Final Year Project Proposal Form.docx
+++ b/Documents/Final Year Project Proposal Form.docx
@@ -839,33 +839,21 @@
                 <w:sz w:val="24"/>
                 <w:szCs w:val="24"/>
               </w:rPr>
-              <w:t xml:space="preserve">Intelligence Food Waste Management Application </w:t>
-            </w:r>
-          </w:p>
-          <w:p>
-            <w:pPr>
-              <w:spacing w:line="360" w:lineRule="atLeast"/>
-              <w:rPr>
-                <w:rFonts w:ascii="Arial" w:hAnsi="Arial" w:cs="Arial"/>
-                <w:i/>
-                <w:iCs/>
-              </w:rPr>
-            </w:pPr>
-            <w:r>
-              <w:rPr>
-                <w:rFonts w:ascii="Arial" w:hAnsi="Arial" w:cs="Arial"/>
-                <w:i/>
-                <w:iCs/>
-              </w:rPr>
-              <w:t xml:space="preserve">Keywords: </w:t>
-            </w:r>
-            <w:r>
-              <w:rPr>
-                <w:rFonts w:ascii="Arial" w:hAnsi="Arial" w:cs="Arial"/>
-                <w:i/>
-                <w:iCs/>
-              </w:rPr>
-              <w:t>Categories relating to the project.</w:t>
+              <w:t>Intelligent Food Waste Management Application for Reducing Household Food Waste</w:t>
+            </w:r>
+          </w:p>
+          <w:p>
+            <w:pPr>
+              <w:spacing w:line="360" w:lineRule="atLeast"/>
+              <w:rPr>
+                <w:rFonts w:ascii="Arial" w:hAnsi="Arial" w:cs="Arial"/>
+              </w:rPr>
+            </w:pPr>
+            <w:r>
+              <w:rPr>
+                <w:rFonts w:ascii="Arial" w:hAnsi="Arial" w:cs="Arial"/>
+              </w:rPr>
+              <w:t>Keywords: Waste Management, Food</w:t>
             </w:r>
           </w:p>
         </w:tc>
@@ -1086,16 +1074,830 @@
               <w:spacing w:line="360" w:lineRule="atLeast"/>
               <w:rPr>
                 <w:rFonts w:ascii="Arial" w:hAnsi="Arial" w:cs="Arial"/>
-                <w:i/>
-                <w:iCs/>
-              </w:rPr>
-            </w:pPr>
-          </w:p>
-          <w:p>
-            <w:pPr>
-              <w:spacing w:line="360" w:lineRule="atLeast"/>
-              <w:rPr>
-                <w:rFonts w:ascii="Arial" w:hAnsi="Arial" w:cs="Arial"/>
+              </w:rPr>
+            </w:pPr>
+          </w:p>
+          <w:p>
+            <w:pPr>
+              <w:spacing w:line="360" w:lineRule="atLeast"/>
+              <w:rPr>
+                <w:rFonts w:ascii="Arial" w:hAnsi="Arial" w:cs="Arial"/>
+              </w:rPr>
+            </w:pPr>
+          </w:p>
+          <w:p>
+            <w:pPr>
+              <w:spacing w:line="360" w:lineRule="atLeast"/>
+              <w:rPr>
+                <w:rFonts w:ascii="Arial" w:hAnsi="Arial" w:cs="Arial"/>
+              </w:rPr>
+            </w:pPr>
+          </w:p>
+          <w:p>
+            <w:pPr>
+              <w:spacing w:line="360" w:lineRule="atLeast"/>
+              <w:rPr>
+                <w:rFonts w:ascii="Arial" w:hAnsi="Arial" w:cs="Arial"/>
+              </w:rPr>
+            </w:pPr>
+            <w:r>
+              <w:rPr>
+                <w:rFonts w:ascii="Arial" w:hAnsi="Arial" w:cs="Arial"/>
+              </w:rPr>
+              <w:t xml:space="preserve">The present world population of 8 billion people is </w:t>
+            </w:r>
+            <w:r>
+              <w:rPr>
+                <w:rFonts w:ascii="Arial" w:hAnsi="Arial" w:cs="Arial"/>
+              </w:rPr>
+              <w:t>projected</w:t>
+            </w:r>
+            <w:r>
+              <w:rPr>
+                <w:rFonts w:ascii="Arial" w:hAnsi="Arial" w:cs="Arial"/>
+              </w:rPr>
+              <w:t xml:space="preserve"> to reach 9.8 billion by 2050. The worldwide demand for food will rise as the population of the world grows, putting strain on the global food supply system. Massive quantities of kitchen and food waste are accumulated </w:t>
+            </w:r>
+            <w:r>
+              <w:rPr>
+                <w:rFonts w:ascii="Arial" w:hAnsi="Arial" w:cs="Arial"/>
+              </w:rPr>
+              <w:t>because of</w:t>
+            </w:r>
+            <w:r>
+              <w:rPr>
+                <w:rFonts w:ascii="Arial" w:hAnsi="Arial" w:cs="Arial"/>
+              </w:rPr>
+              <w:t xml:space="preserve"> industrialization and poor management of waste.</w:t>
+            </w:r>
+            <w:r>
+              <w:rPr>
+                <w:rFonts w:ascii="Arial" w:hAnsi="Arial" w:cs="Arial"/>
+              </w:rPr>
+              <w:fldChar w:fldCharType="begin"/>
+            </w:r>
+            <w:r>
+              <w:rPr>
+                <w:rFonts w:ascii="Arial" w:hAnsi="Arial" w:cs="Arial"/>
+              </w:rPr>
+              <w:instrText xml:space="preserve"> ADDIN ZOTERO_ITEM CSL_CITATION {"citationID":"ypBTucPb","properties":{"formattedCitation":"(Haldar {\\i{}et al.} 2022)","plainCitation":"(Haldar et al. 2022)","noteIndex":0},"citationItems":[{"id":44,"uris":["http://zotero.org/users/local/ALZH0Phn/items/ZV4SSNKD"],"itemData":{"id":44,"type":"article-journal","abstract":"Increased urbanization and industrialization accelerated demand for energy, large-scale waste output, and negative environmental consequences. Therefore, the implementation of an effective solid-waste-management (SWM) policy for the handling of food waste is of great importance. The global food waste generation is estimated at about 1.6 gigatons/yr which attributes to an economic revenue of 750 billion USD. It can be converted into high-value enzymes, surfactants, Poly-hydroxybutyrate, biofuels, etc. However, the heterogeneous composition of food with high organic load and varying moisture content makes their transformation into value-added products difficult. This review aims to bring forth the possibilities and repercussions of food waste management. The socio-economic challenges related to SWM are comprehensively discussed particularly in terms of environmental concern. The engineering aspect in the collection, storage, and biotransformation of food waste into useful value-added products such as biofuels, advanced biomaterials, bioactive compounds, and platform chemicals are critically reviewed for efficient food waste management.","container-title":"Bioresource Technology","DOI":"10.1016/j.biortech.2022.127390","ISSN":"0960-8524","journalAbbreviation":"Bioresource Technology","page":"127390","source":"ScienceDirect","title":"Understanding the management of household food waste and its engineering for sustainable valorization- A state-of-the-art review","volume":"358","author":[{"family":"Haldar","given":"Dibyajyoti"},{"family":"Shabbirahmed","given":"Asma Musfira"},{"family":"Singhania","given":"Reeta Rani"},{"family":"Chen","given":"Chiu-Wen"},{"family":"Dong","given":"Cheng-Di"},{"family":"Ponnusamy","given":"Vinoth Kumar"},{"family":"Patel","given":"Anil Kumar"}],"issued":{"date-parts":[["2022",8,1]]}}}],"schema":"https://github.com/citation-style-language/schema/raw/master/csl-citation.json"} </w:instrText>
+            </w:r>
+            <w:r>
+              <w:rPr>
+                <w:rFonts w:ascii="Arial" w:hAnsi="Arial" w:cs="Arial"/>
+              </w:rPr>
+              <w:fldChar w:fldCharType="separate"/>
+            </w:r>
+            <w:r>
+              <w:rPr>
+                <w:rFonts w:ascii="Arial" w:hAnsi="Arial" w:cs="Arial"/>
+              </w:rPr>
+              <w:t xml:space="preserve">(Haldar </w:t>
+            </w:r>
+            <w:r>
+              <w:rPr>
+                <w:rFonts w:ascii="Arial" w:hAnsi="Arial" w:cs="Arial"/>
+                <w:i/>
+                <w:iCs/>
+              </w:rPr>
+              <w:t>et al.</w:t>
+            </w:r>
+            <w:r>
+              <w:rPr>
+                <w:rFonts w:ascii="Arial" w:hAnsi="Arial" w:cs="Arial"/>
+              </w:rPr>
+              <w:t xml:space="preserve"> 2022)</w:t>
+            </w:r>
+            <w:r>
+              <w:rPr>
+                <w:rFonts w:ascii="Arial" w:hAnsi="Arial" w:cs="Arial"/>
+              </w:rPr>
+              <w:fldChar w:fldCharType="end"/>
+            </w:r>
+            <w:r>
+              <w:rPr>
+                <w:rFonts w:ascii="Arial" w:hAnsi="Arial" w:cs="Arial"/>
+              </w:rPr>
+              <w:t xml:space="preserve">. </w:t>
+            </w:r>
+          </w:p>
+          <w:p>
+            <w:pPr>
+              <w:spacing w:line="360" w:lineRule="atLeast"/>
+              <w:rPr>
+                <w:rFonts w:ascii="Arial" w:hAnsi="Arial" w:cs="Arial"/>
+              </w:rPr>
+            </w:pPr>
+          </w:p>
+          <w:p>
+            <w:pPr>
+              <w:spacing w:line="360" w:lineRule="atLeast"/>
+              <w:rPr>
+                <w:rFonts w:ascii="Arial" w:hAnsi="Arial" w:cs="Arial"/>
+              </w:rPr>
+            </w:pPr>
+            <w:r>
+              <w:rPr>
+                <w:rFonts w:ascii="Arial" w:hAnsi="Arial" w:cs="Arial"/>
+              </w:rPr>
+              <w:t>According to the Food</w:t>
+            </w:r>
+            <w:r>
+              <w:rPr>
+                <w:rFonts w:ascii="Arial" w:hAnsi="Arial" w:cs="Arial"/>
+              </w:rPr>
+              <w:t xml:space="preserve"> and Agriculture Organization (FAO), around 1.3 billion tons of food is lost and squandered every year, costing the world economy 750 billion dollars.</w:t>
+            </w:r>
+            <w:r>
+              <w:rPr>
+                <w:rFonts w:ascii="Arial" w:hAnsi="Arial" w:cs="Arial"/>
+              </w:rPr>
+              <w:fldChar w:fldCharType="begin"/>
+            </w:r>
+            <w:r>
+              <w:rPr>
+                <w:rFonts w:ascii="Arial" w:hAnsi="Arial" w:cs="Arial"/>
+              </w:rPr>
+              <w:instrText xml:space="preserve"> ADDIN ZOTERO_ITEM CSL_CITATION {"citationID":"gRt2sfQr","properties":{"formattedCitation":"(Haldar {\\i{}et al.} 2022)","plainCitation":"(Haldar et al. 2022)","noteIndex":0},"citationItems":[{"id":44,"uris":["http://zotero.org/users/local/ALZH0Phn/items/ZV4SSNKD"],"itemData":{"id":44,"type":"article-journal","abstract":"Increased urbanization and industrialization accelerated demand for energy, large-scale waste output, and negative environmental consequences. Therefore, the implementation of an effective solid-waste-management (SWM) policy for the handling of food waste is of great importance. The global food waste generation is estimated at about 1.6 gigatons/yr which attributes to an economic revenue of 750 billion USD. It can be converted into high-value enzymes, surfactants, Poly-hydroxybutyrate, biofuels, etc. However, the heterogeneous composition of food with high organic load and varying moisture content makes their transformation into value-added products difficult. This review aims to bring forth the possibilities and repercussions of food waste management. The socio-economic challenges related to SWM are comprehensively discussed particularly in terms of environmental concern. The engineering aspect in the collection, storage, and biotransformation of food waste into useful value-added products such as biofuels, advanced biomaterials, bioactive compounds, and platform chemicals are critically reviewed for efficient food waste management.","container-title":"Bioresource Technology","DOI":"10.1016/j.biortech.2022.127390","ISSN":"0960-8524","journalAbbreviation":"Bioresource Technology","page":"127390","source":"ScienceDirect","title":"Understanding the management of household food waste and its engineering for sustainable valorization- A state-of-the-art review","volume":"358","author":[{"family":"Haldar","given":"Dibyajyoti"},{"family":"Shabbirahmed","given":"Asma Musfira"},{"family":"Singhania","given":"Reeta Rani"},{"family":"Chen","given":"Chiu-Wen"},{"family":"Dong","given":"Cheng-Di"},{"family":"Ponnusamy","given":"Vinoth Kumar"},{"family":"Patel","given":"Anil Kumar"}],"issued":{"date-parts":[["2022",8,1]]}}}],"schema":"https://github.com/citation-style-language/schema/raw/master/csl-citation.json"} </w:instrText>
+            </w:r>
+            <w:r>
+              <w:rPr>
+                <w:rFonts w:ascii="Arial" w:hAnsi="Arial" w:cs="Arial"/>
+              </w:rPr>
+              <w:fldChar w:fldCharType="separate"/>
+            </w:r>
+            <w:r>
+              <w:rPr>
+                <w:rFonts w:ascii="Arial" w:hAnsi="Arial" w:cs="Arial"/>
+              </w:rPr>
+              <w:t xml:space="preserve">(Haldar </w:t>
+            </w:r>
+            <w:r>
+              <w:rPr>
+                <w:rFonts w:ascii="Arial" w:hAnsi="Arial" w:cs="Arial"/>
+                <w:i/>
+                <w:iCs/>
+              </w:rPr>
+              <w:t>et al.</w:t>
+            </w:r>
+            <w:r>
+              <w:rPr>
+                <w:rFonts w:ascii="Arial" w:hAnsi="Arial" w:cs="Arial"/>
+              </w:rPr>
+              <w:t xml:space="preserve"> 2022)</w:t>
+            </w:r>
+            <w:r>
+              <w:rPr>
+                <w:rFonts w:ascii="Arial" w:hAnsi="Arial" w:cs="Arial"/>
+              </w:rPr>
+              <w:fldChar w:fldCharType="end"/>
+            </w:r>
+            <w:r>
+              <w:rPr>
+                <w:rFonts w:ascii="Arial" w:hAnsi="Arial" w:cs="Arial"/>
+              </w:rPr>
+              <w:t>.</w:t>
+            </w:r>
+            <w:r>
+              <w:rPr>
+                <w:rFonts w:ascii="Arial" w:hAnsi="Arial" w:cs="Arial"/>
+              </w:rPr>
+              <w:t xml:space="preserve">The </w:t>
+            </w:r>
+            <w:r>
+              <w:rPr>
+                <w:rFonts w:ascii="Arial" w:hAnsi="Arial" w:cs="Arial"/>
+              </w:rPr>
+              <w:t xml:space="preserve">Environmental Protection Agency (EPA) of Ireland estimates that 708,000 tonnes of food waste </w:t>
+            </w:r>
+            <w:r>
+              <w:rPr>
+                <w:rFonts w:ascii="Arial" w:hAnsi="Arial" w:cs="Arial"/>
+              </w:rPr>
+              <w:t>was</w:t>
+            </w:r>
+            <w:r>
+              <w:rPr>
+                <w:rFonts w:ascii="Arial" w:hAnsi="Arial" w:cs="Arial"/>
+              </w:rPr>
+              <w:t xml:space="preserve"> generated in 2024. This equates to 132kg of food waste per person, which is higher than the EU average food waste</w:t>
+            </w:r>
+            <w:r>
+              <w:rPr>
+                <w:rFonts w:ascii="Arial" w:hAnsi="Arial" w:cs="Arial"/>
+              </w:rPr>
+              <w:t xml:space="preserve"> </w:t>
+            </w:r>
+            <w:r>
+              <w:rPr>
+                <w:rFonts w:ascii="Arial" w:hAnsi="Arial" w:cs="Arial"/>
+              </w:rPr>
+              <w:t xml:space="preserve">of 130kg </w:t>
+            </w:r>
+            <w:r>
+              <w:rPr>
+                <w:rFonts w:ascii="Arial" w:hAnsi="Arial" w:cs="Arial"/>
+              </w:rPr>
+              <w:t>per person.</w:t>
+            </w:r>
+            <w:r>
+              <w:rPr>
+                <w:rFonts w:ascii="Arial" w:hAnsi="Arial" w:cs="Arial"/>
+              </w:rPr>
+              <w:t xml:space="preserve"> Out of the 708,000 tonnes, households were at the top of the list with 31% (219,000 tonnes) of the total wastage.</w:t>
+            </w:r>
+            <w:r>
+              <w:rPr>
+                <w:rFonts w:ascii="Arial" w:hAnsi="Arial" w:cs="Arial"/>
+              </w:rPr>
+              <w:fldChar w:fldCharType="begin"/>
+            </w:r>
+            <w:r>
+              <w:rPr>
+                <w:rFonts w:ascii="Arial" w:hAnsi="Arial" w:cs="Arial"/>
+              </w:rPr>
+              <w:instrText xml:space="preserve"> ADDIN ZOTERO_ITEM CSL_CITATION {"citationID":"zC8m7iW1","properties":{"formattedCitation":"(Agency 2026)","plainCitation":"(Agency 2026)","noteIndex":0},"citationItems":[{"id":46,"uris":["http://zotero.org/users/local/ALZH0Phn/items/EUSXIBAN"],"itemData":{"id":46,"type":"webpage","language":"en","title":"Food Waste Statistics for Ireland","URL":"https://www.epa.ie/our-services/monitoring--assessment/waste/national-waste-statistics/food/","author":[{"family":"Agency","given":"Environmental Protection"}],"accessed":{"date-parts":[["2026",10,2]]}}}],"schema":"https://github.com/citation-style-language/schema/raw/master/csl-citation.json"} </w:instrText>
+            </w:r>
+            <w:r>
+              <w:rPr>
+                <w:rFonts w:ascii="Arial" w:hAnsi="Arial" w:cs="Arial"/>
+              </w:rPr>
+              <w:fldChar w:fldCharType="separate"/>
+            </w:r>
+            <w:r>
+              <w:rPr>
+                <w:rFonts w:ascii="Arial" w:hAnsi="Arial" w:cs="Arial"/>
+              </w:rPr>
+              <w:t>(Agency 2026)</w:t>
+            </w:r>
+            <w:r>
+              <w:rPr>
+                <w:rFonts w:ascii="Arial" w:hAnsi="Arial" w:cs="Arial"/>
+              </w:rPr>
+              <w:fldChar w:fldCharType="end"/>
+            </w:r>
+            <w:r>
+              <w:rPr>
+                <w:rFonts w:ascii="Arial" w:hAnsi="Arial" w:cs="Arial"/>
+              </w:rPr>
+              <w:t>.</w:t>
+            </w:r>
+          </w:p>
+          <w:p>
+            <w:pPr>
+              <w:spacing w:line="360" w:lineRule="atLeast"/>
+              <w:rPr>
+                <w:rFonts w:ascii="Arial" w:hAnsi="Arial" w:cs="Arial"/>
+              </w:rPr>
+            </w:pPr>
+          </w:p>
+          <w:p>
+            <w:pPr>
+              <w:spacing w:line="360" w:lineRule="atLeast"/>
+              <w:rPr>
+                <w:rFonts w:ascii="Arial" w:hAnsi="Arial" w:cs="Arial"/>
+              </w:rPr>
+            </w:pPr>
+            <w:r>
+              <w:rPr>
+                <w:rFonts w:ascii="Arial" w:hAnsi="Arial" w:cs="Arial"/>
+              </w:rPr>
+              <w:t>Food waste cost</w:t>
+            </w:r>
+            <w:r>
+              <w:rPr>
+                <w:rFonts w:ascii="Arial" w:hAnsi="Arial" w:cs="Arial"/>
+              </w:rPr>
+              <w:t xml:space="preserve">s </w:t>
+            </w:r>
+            <w:r>
+              <w:rPr>
+                <w:rFonts w:ascii="Arial" w:hAnsi="Arial" w:cs="Arial"/>
+              </w:rPr>
+              <w:t>the average Irish household around €60 per month</w:t>
+            </w:r>
+            <w:r>
+              <w:rPr>
+                <w:rFonts w:ascii="Arial" w:hAnsi="Arial" w:cs="Arial"/>
+              </w:rPr>
+              <w:t xml:space="preserve"> which equates to </w:t>
+            </w:r>
+            <w:r>
+              <w:rPr>
+                <w:rFonts w:ascii="Arial" w:hAnsi="Arial" w:cs="Arial"/>
+              </w:rPr>
+              <w:t xml:space="preserve">€700 per year. </w:t>
+            </w:r>
+            <w:r>
+              <w:rPr>
+                <w:rFonts w:ascii="Arial" w:hAnsi="Arial" w:cs="Arial"/>
+              </w:rPr>
+              <w:t>That’s</w:t>
+            </w:r>
+            <w:r>
+              <w:rPr>
+                <w:rFonts w:ascii="Arial" w:hAnsi="Arial" w:cs="Arial"/>
+              </w:rPr>
+              <w:t xml:space="preserve"> an annual national cost of €1.29 billion. </w:t>
+            </w:r>
+            <w:r>
+              <w:rPr>
+                <w:rFonts w:ascii="Arial" w:hAnsi="Arial" w:cs="Arial"/>
+              </w:rPr>
+              <w:fldChar w:fldCharType="begin"/>
+            </w:r>
+            <w:r>
+              <w:rPr>
+                <w:rFonts w:ascii="Arial" w:hAnsi="Arial" w:cs="Arial"/>
+              </w:rPr>
+              <w:instrText xml:space="preserve"> ADDIN ZOTERO_ITEM CSL_CITATION {"citationID":"m4O6c7QB","properties":{"formattedCitation":"(Agency 2026)","plainCitation":"(Agency 2026)","noteIndex":0},"citationItems":[{"id":46,"uris":["http://zotero.org/users/local/ALZH0Phn/items/EUSXIBAN"],"itemData":{"id":46,"type":"webpage","language":"en","title":"Food Waste Statistics for Ireland","URL":"https://www.epa.ie/our-services/monitoring--assessment/waste/national-waste-statistics/food/","author":[{"family":"Agency","given":"Environmental Protection"}],"accessed":{"date-parts":[["2026",10,2]]}}}],"schema":"https://github.com/citation-style-language/schema/raw/master/csl-citation.json"} </w:instrText>
+            </w:r>
+            <w:r>
+              <w:rPr>
+                <w:rFonts w:ascii="Arial" w:hAnsi="Arial" w:cs="Arial"/>
+              </w:rPr>
+              <w:fldChar w:fldCharType="separate"/>
+            </w:r>
+            <w:r>
+              <w:rPr>
+                <w:rFonts w:ascii="Arial" w:hAnsi="Arial" w:cs="Arial"/>
+              </w:rPr>
+              <w:t>(Agency 2026)</w:t>
+            </w:r>
+            <w:r>
+              <w:rPr>
+                <w:rFonts w:ascii="Arial" w:hAnsi="Arial" w:cs="Arial"/>
+              </w:rPr>
+              <w:fldChar w:fldCharType="end"/>
+            </w:r>
+            <w:r>
+              <w:rPr>
+                <w:rFonts w:ascii="Arial" w:hAnsi="Arial" w:cs="Arial"/>
+              </w:rPr>
+              <w:t>.</w:t>
+            </w:r>
+            <w:r>
+              <w:rPr>
+                <w:rFonts w:ascii="Arial" w:hAnsi="Arial" w:cs="Arial"/>
+              </w:rPr>
+              <w:t xml:space="preserve"> </w:t>
+            </w:r>
+            <w:r>
+              <w:rPr>
+                <w:rFonts w:ascii="Arial" w:hAnsi="Arial" w:cs="Arial"/>
+              </w:rPr>
+              <w:t>Food waste prevention is therefore an important approach to reducing the environmental and economic impacts associated with household food waste.</w:t>
+            </w:r>
+          </w:p>
+          <w:p>
+            <w:pPr>
+              <w:spacing w:line="360" w:lineRule="atLeast"/>
+              <w:rPr>
+                <w:rFonts w:ascii="Arial" w:hAnsi="Arial" w:cs="Arial"/>
+              </w:rPr>
+            </w:pPr>
+          </w:p>
+          <w:p>
+            <w:pPr>
+              <w:spacing w:line="360" w:lineRule="atLeast"/>
+              <w:rPr>
+                <w:rFonts w:ascii="Arial" w:hAnsi="Arial" w:cs="Arial"/>
+              </w:rPr>
+            </w:pPr>
+          </w:p>
+          <w:p>
+            <w:pPr>
+              <w:spacing w:line="360" w:lineRule="atLeast"/>
+              <w:rPr>
+                <w:rFonts w:ascii="Arial" w:hAnsi="Arial" w:cs="Arial"/>
+              </w:rPr>
+            </w:pPr>
+          </w:p>
+          <w:p>
+            <w:pPr>
+              <w:spacing w:line="360" w:lineRule="atLeast"/>
+              <w:rPr>
+                <w:rFonts w:ascii="Arial" w:hAnsi="Arial" w:cs="Arial"/>
+              </w:rPr>
+            </w:pPr>
+          </w:p>
+          <w:p>
+            <w:pPr>
+              <w:spacing w:line="360" w:lineRule="atLeast"/>
+              <w:rPr>
+                <w:rFonts w:ascii="Arial" w:hAnsi="Arial" w:cs="Arial"/>
+              </w:rPr>
+            </w:pPr>
+          </w:p>
+          <w:p>
+            <w:pPr>
+              <w:spacing w:line="360" w:lineRule="atLeast"/>
+              <w:rPr>
+                <w:rFonts w:ascii="Arial" w:hAnsi="Arial" w:cs="Arial"/>
+              </w:rPr>
+            </w:pPr>
+          </w:p>
+          <w:p>
+            <w:pPr>
+              <w:spacing w:line="360" w:lineRule="atLeast"/>
+              <w:rPr>
+                <w:rFonts w:ascii="Arial" w:hAnsi="Arial" w:cs="Arial"/>
+              </w:rPr>
+            </w:pPr>
+          </w:p>
+          <w:p>
+            <w:pPr>
+              <w:spacing w:line="360" w:lineRule="atLeast"/>
+              <w:rPr>
+                <w:rFonts w:ascii="Arial" w:hAnsi="Arial" w:cs="Arial"/>
+              </w:rPr>
+            </w:pPr>
+          </w:p>
+          <w:p>
+            <w:pPr>
+              <w:spacing w:line="360" w:lineRule="atLeast"/>
+              <w:rPr>
+                <w:rFonts w:ascii="Arial" w:hAnsi="Arial" w:cs="Arial"/>
+              </w:rPr>
+            </w:pPr>
+          </w:p>
+          <w:p>
+            <w:pPr>
+              <w:spacing w:line="360" w:lineRule="atLeast"/>
+              <w:rPr>
+                <w:rFonts w:ascii="Arial" w:hAnsi="Arial" w:cs="Arial"/>
+              </w:rPr>
+            </w:pPr>
+          </w:p>
+          <w:p>
+            <w:pPr>
+              <w:spacing w:line="360" w:lineRule="atLeast"/>
+              <w:rPr>
+                <w:rFonts w:ascii="Arial" w:hAnsi="Arial" w:cs="Arial"/>
+              </w:rPr>
+            </w:pPr>
+          </w:p>
+          <w:p>
+            <w:pPr>
+              <w:spacing w:line="360" w:lineRule="atLeast"/>
+              <w:rPr>
+                <w:rFonts w:ascii="Arial" w:hAnsi="Arial" w:cs="Arial"/>
+                <w:b/>
+                <w:bCs/>
+              </w:rPr>
+            </w:pPr>
+            <w:r>
+              <w:rPr>
+                <w:rFonts w:ascii="Arial" w:hAnsi="Arial" w:cs="Arial"/>
+                <w:b/>
+                <w:bCs/>
+              </w:rPr>
+              <w:t>Why does this happen in household</w:t>
+            </w:r>
+            <w:r>
+              <w:rPr>
+                <w:rFonts w:ascii="Arial" w:hAnsi="Arial" w:cs="Arial"/>
+                <w:b/>
+                <w:bCs/>
+              </w:rPr>
+              <w:t>s?</w:t>
+            </w:r>
+          </w:p>
+          <w:p>
+            <w:pPr>
+              <w:spacing w:line="360" w:lineRule="atLeast"/>
+              <w:rPr>
+                <w:rFonts w:ascii="Arial" w:hAnsi="Arial" w:cs="Arial"/>
+                <w:b/>
+                <w:bCs/>
+              </w:rPr>
+            </w:pPr>
+          </w:p>
+          <w:p>
+            <w:pPr>
+              <w:spacing w:line="360" w:lineRule="atLeast"/>
+              <w:rPr>
+                <w:rFonts w:ascii="Arial" w:hAnsi="Arial" w:cs="Arial"/>
+                <w:b/>
+                <w:bCs/>
+              </w:rPr>
+            </w:pPr>
+            <w:r>
+              <w:rPr>
+                <w:rFonts w:ascii="Arial" w:hAnsi="Arial" w:cs="Arial"/>
+                <w:b/>
+                <w:bCs/>
+              </w:rPr>
+              <w:drawing>
+                <wp:inline distT="0" distB="0" distL="0" distR="0" wp14:anchorId="6C1AC99B" wp14:editId="5AB536D1">
+                  <wp:extent cx="5706271" cy="2800741"/>
+                  <wp:effectExtent l="0" t="0" r="0" b="0"/>
+                  <wp:docPr id="226204015" name="Picture 1"/>
+                  <wp:cNvGraphicFramePr>
+                    <a:graphicFrameLocks xmlns:a="http://schemas.openxmlformats.org/drawingml/2006/main" noChangeAspect="1"/>
+                  </wp:cNvGraphicFramePr>
+                  <a:graphic xmlns:a="http://schemas.openxmlformats.org/drawingml/2006/main">
+                    <a:graphicData uri="http://schemas.openxmlformats.org/drawingml/2006/picture">
+                      <pic:pic xmlns:pic="http://schemas.openxmlformats.org/drawingml/2006/picture">
+                        <pic:nvPicPr>
+                          <pic:cNvPr id="226204015" name=""/>
+                          <pic:cNvPicPr/>
+                        </pic:nvPicPr>
+                        <pic:blipFill>
+                          <a:blip r:embed="rId8"/>
+                          <a:stretch>
+                            <a:fillRect/>
+                          </a:stretch>
+                        </pic:blipFill>
+                        <pic:spPr>
+                          <a:xfrm>
+                            <a:off x="0" y="0"/>
+                            <a:ext cx="5706271" cy="2800741"/>
+                          </a:xfrm>
+                          <a:prstGeom prst="rect">
+                            <a:avLst/>
+                          </a:prstGeom>
+                        </pic:spPr>
+                      </pic:pic>
+                    </a:graphicData>
+                  </a:graphic>
+                </wp:inline>
+              </w:drawing>
+            </w:r>
+          </w:p>
+          <w:p>
+            <w:pPr>
+              <w:spacing w:line="360" w:lineRule="atLeast"/>
+              <w:jc w:val="center"/>
+              <w:rPr>
+                <w:rFonts w:ascii="Arial" w:hAnsi="Arial" w:cs="Arial"/>
+                <w:b/>
+                <w:bCs/>
+              </w:rPr>
+            </w:pPr>
+            <w:r>
+              <w:rPr>
+                <w:rFonts w:ascii="Arial" w:hAnsi="Arial" w:cs="Arial"/>
+                <w:b/>
+                <w:bCs/>
+              </w:rPr>
+              <w:t>Figure 1: Household Food Waste Journey</w:t>
+            </w:r>
+          </w:p>
+          <w:p>
+            <w:pPr>
+              <w:spacing w:line="360" w:lineRule="atLeast"/>
+              <w:jc w:val="center"/>
+              <w:rPr>
+                <w:rFonts w:ascii="Arial" w:hAnsi="Arial" w:cs="Arial"/>
+                <w:b/>
+                <w:bCs/>
+              </w:rPr>
+            </w:pPr>
+            <w:r>
+              <w:rPr>
+                <w:rFonts w:ascii="Arial" w:hAnsi="Arial" w:cs="Arial"/>
+                <w:b/>
+                <w:bCs/>
+              </w:rPr>
+              <w:fldChar w:fldCharType="begin"/>
+            </w:r>
+            <w:r>
+              <w:rPr>
+                <w:rFonts w:ascii="Arial" w:hAnsi="Arial" w:cs="Arial"/>
+                <w:b/>
+                <w:bCs/>
+              </w:rPr>
+              <w:instrText xml:space="preserve"> ADDIN ZOTERO_ITEM CSL_CITATION {"citationID":"TKb9ULAY","properties":{"formattedCitation":"(Schanes {\\i{}et al.} 2018)","plainCitation":"(Schanes et al. 2018)","noteIndex":0},"citationItems":[{"id":42,"uris":["http://zotero.org/users/local/ALZH0Phn/items/BBQBK47K"],"itemData":{"id":42,"type":"article-journal","abstract":"In recent years, food waste has received growing interest from local, national and European policymakers, international organisations, NGOs as well as academics from various disciplinary fields. Increasing concerns about food security and environmental impacts, such as resource depletion and greenhouse gas emissions attributed to food waste, have intensified attention to the topic. While food waste occurs in all stages of the food supply chain, private households have been identified as key actors in food waste generation. However, the evidence on why food waste occurs remains scattered. This paper maps the still small but expanding academic territory of consumer food waste by systematically reviewing empirical studies on food waste practices as well as distilling factors that foster and impede the generation of food waste on the household level. Moreover, we briefly discuss the contributions of different social ontologies, more particularly psychology-related approaches and social practice theory. The analysis reveals food waste as a complex and multi-faceted issue that cannot be attributed to single variables; this also calls for a stronger integration of different disciplinary perspectives. Mapping the determinants of waste generation deepens the understanding of household practices and helps design food waste prevention strategies. Finally, we link the identified factors with a set of policy, business, and retailer options.","container-title":"Journal of Cleaner Production","DOI":"10.1016/j.jclepro.2018.02.030","ISSN":"0959-6526","journalAbbreviation":"Journal of Cleaner Production","page":"978-991","source":"ScienceDirect","title":"Food waste matters - A systematic review of household food waste practices and their policy implications","volume":"182","author":[{"family":"Schanes","given":"Karin"},{"family":"Dobernig","given":"Karin"},{"family":"Gözet","given":"Burcu"}],"issued":{"date-parts":[["2018",5,1]]}}}],"schema":"https://github.com/citation-style-language/schema/raw/master/csl-citation.json"} </w:instrText>
+            </w:r>
+            <w:r>
+              <w:rPr>
+                <w:rFonts w:ascii="Arial" w:hAnsi="Arial" w:cs="Arial"/>
+                <w:b/>
+                <w:bCs/>
+              </w:rPr>
+              <w:fldChar w:fldCharType="separate"/>
+            </w:r>
+            <w:r>
+              <w:rPr>
+                <w:rFonts w:ascii="Arial" w:hAnsi="Arial" w:cs="Arial"/>
+              </w:rPr>
+              <w:t>(</w:t>
+            </w:r>
+            <w:proofErr w:type="spellStart"/>
+            <w:r>
+              <w:rPr>
+                <w:rFonts w:ascii="Arial" w:hAnsi="Arial" w:cs="Arial"/>
+              </w:rPr>
+              <w:t>Schanes</w:t>
+            </w:r>
+            <w:proofErr w:type="spellEnd"/>
+            <w:r>
+              <w:rPr>
+                <w:rFonts w:ascii="Arial" w:hAnsi="Arial" w:cs="Arial"/>
+              </w:rPr>
+              <w:t xml:space="preserve"> </w:t>
+            </w:r>
+            <w:r>
+              <w:rPr>
+                <w:rFonts w:ascii="Arial" w:hAnsi="Arial" w:cs="Arial"/>
+                <w:i/>
+                <w:iCs/>
+              </w:rPr>
+              <w:t>et al.</w:t>
+            </w:r>
+            <w:r>
+              <w:rPr>
+                <w:rFonts w:ascii="Arial" w:hAnsi="Arial" w:cs="Arial"/>
+              </w:rPr>
+              <w:t xml:space="preserve"> 2018)</w:t>
+            </w:r>
+            <w:r>
+              <w:rPr>
+                <w:rFonts w:ascii="Arial" w:hAnsi="Arial" w:cs="Arial"/>
+                <w:b/>
+                <w:bCs/>
+              </w:rPr>
+              <w:fldChar w:fldCharType="end"/>
+            </w:r>
+          </w:p>
+          <w:p>
+            <w:pPr>
+              <w:spacing w:line="360" w:lineRule="atLeast"/>
+              <w:rPr>
+                <w:rFonts w:ascii="Arial" w:hAnsi="Arial" w:cs="Arial"/>
+                <w:b/>
+                <w:bCs/>
+              </w:rPr>
+            </w:pPr>
+          </w:p>
+          <w:p>
+            <w:pPr>
+              <w:spacing w:line="360" w:lineRule="atLeast"/>
+              <w:rPr>
+                <w:rFonts w:ascii="Arial" w:hAnsi="Arial" w:cs="Arial"/>
+              </w:rPr>
+            </w:pPr>
+            <w:r>
+              <w:rPr>
+                <w:rFonts w:ascii="Arial" w:hAnsi="Arial" w:cs="Arial"/>
+              </w:rPr>
+              <w:t xml:space="preserve">My project is aimed primarily at the planning stage of the household food waste journey. </w:t>
+            </w:r>
+            <w:r>
+              <w:rPr>
+                <w:rFonts w:ascii="Arial" w:hAnsi="Arial" w:cs="Arial"/>
+              </w:rPr>
+              <w:t>A</w:t>
+            </w:r>
+            <w:r>
+              <w:rPr>
+                <w:rFonts w:ascii="Arial" w:hAnsi="Arial" w:cs="Arial"/>
+              </w:rPr>
+              <w:t xml:space="preserve">s shown in Figure 1, </w:t>
+            </w:r>
+            <w:r>
+              <w:rPr>
+                <w:rFonts w:ascii="Arial" w:hAnsi="Arial" w:cs="Arial"/>
+              </w:rPr>
+              <w:t>a l</w:t>
+            </w:r>
+            <w:r>
+              <w:rPr>
+                <w:rFonts w:ascii="Arial" w:hAnsi="Arial" w:cs="Arial"/>
+              </w:rPr>
+              <w:t xml:space="preserve">ack of </w:t>
+            </w:r>
+            <w:r>
+              <w:rPr>
+                <w:rFonts w:ascii="Arial" w:hAnsi="Arial" w:cs="Arial"/>
+              </w:rPr>
+              <w:t>c</w:t>
+            </w:r>
+            <w:r>
+              <w:rPr>
+                <w:rFonts w:ascii="Arial" w:hAnsi="Arial" w:cs="Arial"/>
+              </w:rPr>
+              <w:t xml:space="preserve">hecking </w:t>
+            </w:r>
+            <w:r>
+              <w:rPr>
+                <w:rFonts w:ascii="Arial" w:hAnsi="Arial" w:cs="Arial"/>
+              </w:rPr>
+              <w:t xml:space="preserve">what food is already available </w:t>
+            </w:r>
+            <w:r>
+              <w:rPr>
+                <w:rFonts w:ascii="Arial" w:hAnsi="Arial" w:cs="Arial"/>
+              </w:rPr>
+              <w:t xml:space="preserve">in the house and a lack of meal planning can contribute to wasteful behaviour </w:t>
+            </w:r>
+            <w:r>
+              <w:rPr>
+                <w:rFonts w:ascii="Arial" w:hAnsi="Arial" w:cs="Arial"/>
+              </w:rPr>
+              <w:fldChar w:fldCharType="begin"/>
+            </w:r>
+            <w:r>
+              <w:rPr>
+                <w:rFonts w:ascii="Arial" w:hAnsi="Arial" w:cs="Arial"/>
+              </w:rPr>
+              <w:instrText xml:space="preserve"> ADDIN ZOTERO_ITEM CSL_CITATION {"citationID":"WOZLONAj","properties":{"formattedCitation":"(Schanes {\\i{}et al.} 2018)","plainCitation":"(Schanes et al. 2018)","noteIndex":0},"citationItems":[{"id":42,"uris":["http://zotero.org/users/local/ALZH0Phn/items/BBQBK47K"],"itemData":{"id":42,"type":"article-journal","abstract":"In recent years, food waste has received growing interest from local, national and European policymakers, international organisations, NGOs as well as academics from various disciplinary fields. Increasing concerns about food security and environmental impacts, such as resource depletion and greenhouse gas emissions attributed to food waste, have intensified attention to the topic. While food waste occurs in all stages of the food supply chain, private households have been identified as key actors in food waste generation. However, the evidence on why food waste occurs remains scattered. This paper maps the still small but expanding academic territory of consumer food waste by systematically reviewing empirical studies on food waste practices as well as distilling factors that foster and impede the generation of food waste on the household level. Moreover, we briefly discuss the contributions of different social ontologies, more particularly psychology-related approaches and social practice theory. The analysis reveals food waste as a complex and multi-faceted issue that cannot be attributed to single variables; this also calls for a stronger integration of different disciplinary perspectives. Mapping the determinants of waste generation deepens the understanding of household practices and helps design food waste prevention strategies. Finally, we link the identified factors with a set of policy, business, and retailer options.","container-title":"Journal of Cleaner Production","DOI":"10.1016/j.jclepro.2018.02.030","ISSN":"0959-6526","journalAbbreviation":"Journal of Cleaner Production","page":"978-991","source":"ScienceDirect","title":"Food waste matters - A systematic review of household food waste practices and their policy implications","volume":"182","author":[{"family":"Schanes","given":"Karin"},{"family":"Dobernig","given":"Karin"},{"family":"Gözet","given":"Burcu"}],"issued":{"date-parts":[["2018",5,1]]}}}],"schema":"https://github.com/citation-style-language/schema/raw/master/csl-citation.json"} </w:instrText>
+            </w:r>
+            <w:r>
+              <w:rPr>
+                <w:rFonts w:ascii="Arial" w:hAnsi="Arial" w:cs="Arial"/>
+              </w:rPr>
+              <w:fldChar w:fldCharType="separate"/>
+            </w:r>
+            <w:r>
+              <w:rPr>
+                <w:rFonts w:ascii="Arial" w:hAnsi="Arial" w:cs="Arial"/>
+              </w:rPr>
+              <w:t>(</w:t>
+            </w:r>
+            <w:proofErr w:type="spellStart"/>
+            <w:r>
+              <w:rPr>
+                <w:rFonts w:ascii="Arial" w:hAnsi="Arial" w:cs="Arial"/>
+              </w:rPr>
+              <w:t>Schanes</w:t>
+            </w:r>
+            <w:proofErr w:type="spellEnd"/>
+            <w:r>
+              <w:rPr>
+                <w:rFonts w:ascii="Arial" w:hAnsi="Arial" w:cs="Arial"/>
+              </w:rPr>
+              <w:t xml:space="preserve"> </w:t>
+            </w:r>
+            <w:r>
+              <w:rPr>
+                <w:rFonts w:ascii="Arial" w:hAnsi="Arial" w:cs="Arial"/>
+                <w:i/>
+                <w:iCs/>
+              </w:rPr>
+              <w:t>et al.</w:t>
+            </w:r>
+            <w:r>
+              <w:rPr>
+                <w:rFonts w:ascii="Arial" w:hAnsi="Arial" w:cs="Arial"/>
+              </w:rPr>
+              <w:t xml:space="preserve"> 2018)</w:t>
+            </w:r>
+            <w:r>
+              <w:rPr>
+                <w:rFonts w:ascii="Arial" w:hAnsi="Arial" w:cs="Arial"/>
+              </w:rPr>
+              <w:fldChar w:fldCharType="end"/>
+            </w:r>
+            <w:r>
+              <w:rPr>
+                <w:rFonts w:ascii="Arial" w:hAnsi="Arial" w:cs="Arial"/>
+              </w:rPr>
+              <w:t>. These behaviours can result in households purchasing food that they already have, failing to use food before it expires, or purchasing ingredients without having a plan for how they will be used.</w:t>
+            </w:r>
+          </w:p>
+          <w:p>
+            <w:pPr>
+              <w:spacing w:line="360" w:lineRule="atLeast"/>
+              <w:rPr>
+                <w:rFonts w:ascii="Arial" w:hAnsi="Arial" w:cs="Arial"/>
+              </w:rPr>
+            </w:pPr>
+          </w:p>
+          <w:p>
+            <w:pPr>
+              <w:spacing w:line="360" w:lineRule="atLeast"/>
+              <w:rPr>
+                <w:rFonts w:ascii="Arial" w:hAnsi="Arial" w:cs="Arial"/>
+              </w:rPr>
+            </w:pPr>
+            <w:r>
+              <w:rPr>
+                <w:rFonts w:ascii="Arial" w:hAnsi="Arial" w:cs="Arial"/>
+              </w:rPr>
+              <w:t>The proposed application aims to address these issues by providing users with a digital catalogue of the food and products that are in their household. Users will be able to record the food they have and the relevant information such as expiry dates. This will provide the users with greater visibility of the food already inside there home and help them make more informed decisions when it comes to planning meals and purchasing additional food.</w:t>
+            </w:r>
+          </w:p>
+        </w:tc>
+      </w:tr>
+      <w:tr>
+        <w:trPr>
+          <w:trHeight w:val="11132"/>
+        </w:trPr>
+        <w:tc>
+          <w:tcPr>
+            <w:tcW w:w="9377" w:type="dxa"/>
+          </w:tcPr>
+          <w:p>
+            <w:pPr>
+              <w:spacing w:line="360" w:lineRule="atLeast"/>
+              <w:rPr>
+                <w:rFonts w:ascii="Arial" w:hAnsi="Arial" w:cs="Arial"/>
+                <w:i/>
+                <w:iCs/>
+                <w:sz w:val="24"/>
+                <w:szCs w:val="24"/>
               </w:rPr>
             </w:pPr>
           </w:p>
@@ -1114,6 +1916,16 @@
           <w:szCs w:val="24"/>
         </w:rPr>
       </w:pPr>
+      <w:r>
+        <w:rPr>
+          <w:rFonts w:ascii="Arial" w:hAnsi="Arial" w:cs="Arial"/>
+          <w:b/>
+          <w:bCs/>
+          <w:sz w:val="24"/>
+          <w:szCs w:val="24"/>
+        </w:rPr>
+        <w:t xml:space="preserve"> </w:t>
+      </w:r>
     </w:p>
     <w:p>
       <w:pPr>
@@ -1135,7 +1947,6 @@
           <w:sz w:val="24"/>
           <w:szCs w:val="24"/>
         </w:rPr>
-        <w:lastRenderedPageBreak/>
         <w:t>3.</w:t>
       </w:r>
       <w:r>
@@ -1251,6 +2062,7 @@
                 <w:sz w:val="24"/>
                 <w:szCs w:val="24"/>
               </w:rPr>
+              <w:lastRenderedPageBreak/>
               <w:t>Clear statement of the overall aim of your project</w:t>
             </w:r>
             <w:r>
@@ -1269,6 +2081,8 @@
               <w:spacing w:line="360" w:lineRule="atLeast"/>
               <w:rPr>
                 <w:rFonts w:ascii="Arial" w:hAnsi="Arial" w:cs="Arial"/>
+                <w:i/>
+                <w:iCs/>
                 <w:sz w:val="24"/>
                 <w:szCs w:val="24"/>
               </w:rPr>
@@ -1293,6 +2107,394 @@
               </w:rPr>
               <w:t>.</w:t>
             </w:r>
+          </w:p>
+          <w:p>
+            <w:pPr>
+              <w:spacing w:line="360" w:lineRule="atLeast"/>
+              <w:rPr>
+                <w:rFonts w:ascii="Arial" w:hAnsi="Arial" w:cs="Arial"/>
+                <w:i/>
+                <w:iCs/>
+                <w:sz w:val="24"/>
+                <w:szCs w:val="24"/>
+              </w:rPr>
+            </w:pPr>
+          </w:p>
+          <w:p>
+            <w:pPr>
+              <w:spacing w:line="360" w:lineRule="atLeast"/>
+              <w:rPr>
+                <w:rFonts w:ascii="Arial" w:hAnsi="Arial" w:cs="Arial"/>
+                <w:sz w:val="24"/>
+                <w:szCs w:val="24"/>
+              </w:rPr>
+            </w:pPr>
+            <w:r>
+              <w:rPr>
+                <w:rFonts w:ascii="Arial" w:hAnsi="Arial" w:cs="Arial"/>
+                <w:sz w:val="24"/>
+                <w:szCs w:val="24"/>
+              </w:rPr>
+              <w:t>The overall aim of my project is to help reduce household food wastage by providing an intelligent application that will have the following core requirements:</w:t>
+            </w:r>
+          </w:p>
+          <w:p>
+            <w:pPr>
+              <w:spacing w:line="360" w:lineRule="atLeast"/>
+              <w:rPr>
+                <w:rFonts w:ascii="Arial" w:hAnsi="Arial" w:cs="Arial"/>
+                <w:sz w:val="24"/>
+                <w:szCs w:val="24"/>
+              </w:rPr>
+            </w:pPr>
+          </w:p>
+          <w:p>
+            <w:pPr>
+              <w:pStyle w:val="ListParagraph"/>
+              <w:numPr>
+                <w:ilvl w:val="0"/>
+                <w:numId w:val="5"/>
+              </w:numPr>
+              <w:spacing w:line="360" w:lineRule="atLeast"/>
+              <w:rPr>
+                <w:rFonts w:ascii="Arial" w:hAnsi="Arial" w:cs="Arial"/>
+                <w:sz w:val="24"/>
+                <w:szCs w:val="24"/>
+              </w:rPr>
+            </w:pPr>
+            <w:r>
+              <w:rPr>
+                <w:rFonts w:ascii="Arial" w:hAnsi="Arial" w:cs="Arial"/>
+                <w:b/>
+                <w:bCs/>
+                <w:sz w:val="24"/>
+                <w:szCs w:val="24"/>
+              </w:rPr>
+              <w:t xml:space="preserve">Food Inventory Management </w:t>
+            </w:r>
+            <w:r>
+              <w:rPr>
+                <w:rFonts w:ascii="Arial" w:hAnsi="Arial" w:cs="Arial"/>
+                <w:sz w:val="24"/>
+                <w:szCs w:val="24"/>
+              </w:rPr>
+              <w:t>– Users will be able to add, edit, remove and view food items stored at home.</w:t>
+            </w:r>
+          </w:p>
+          <w:p>
+            <w:pPr>
+              <w:pStyle w:val="ListParagraph"/>
+              <w:spacing w:line="360" w:lineRule="atLeast"/>
+              <w:rPr>
+                <w:rFonts w:ascii="Arial" w:hAnsi="Arial" w:cs="Arial"/>
+                <w:sz w:val="24"/>
+                <w:szCs w:val="24"/>
+              </w:rPr>
+            </w:pPr>
+          </w:p>
+          <w:p>
+            <w:pPr>
+              <w:pStyle w:val="ListParagraph"/>
+              <w:numPr>
+                <w:ilvl w:val="0"/>
+                <w:numId w:val="5"/>
+              </w:numPr>
+              <w:spacing w:line="360" w:lineRule="atLeast"/>
+              <w:rPr>
+                <w:rFonts w:ascii="Arial" w:hAnsi="Arial" w:cs="Arial"/>
+                <w:sz w:val="24"/>
+                <w:szCs w:val="24"/>
+              </w:rPr>
+            </w:pPr>
+            <w:r>
+              <w:rPr>
+                <w:rFonts w:ascii="Arial" w:hAnsi="Arial" w:cs="Arial"/>
+                <w:b/>
+                <w:bCs/>
+                <w:sz w:val="24"/>
+                <w:szCs w:val="24"/>
+              </w:rPr>
+              <w:t xml:space="preserve">Expiry-Date Tracking </w:t>
+            </w:r>
+            <w:r>
+              <w:rPr>
+                <w:rFonts w:ascii="Arial" w:hAnsi="Arial" w:cs="Arial"/>
+                <w:sz w:val="24"/>
+                <w:szCs w:val="24"/>
+              </w:rPr>
+              <w:t>–</w:t>
+            </w:r>
+            <w:r>
+              <w:rPr>
+                <w:rFonts w:ascii="Arial" w:hAnsi="Arial" w:cs="Arial"/>
+                <w:sz w:val="24"/>
+                <w:szCs w:val="24"/>
+              </w:rPr>
+              <w:t xml:space="preserve"> The system will record expiry/best-before dates and identify foods that need to be used soon.</w:t>
+            </w:r>
+          </w:p>
+          <w:p>
+            <w:pPr>
+              <w:pStyle w:val="ListParagraph"/>
+              <w:rPr>
+                <w:rFonts w:ascii="Arial" w:hAnsi="Arial" w:cs="Arial"/>
+                <w:sz w:val="24"/>
+                <w:szCs w:val="24"/>
+              </w:rPr>
+            </w:pPr>
+          </w:p>
+          <w:p>
+            <w:pPr>
+              <w:pStyle w:val="ListParagraph"/>
+              <w:numPr>
+                <w:ilvl w:val="0"/>
+                <w:numId w:val="5"/>
+              </w:numPr>
+              <w:spacing w:line="360" w:lineRule="atLeast"/>
+              <w:rPr>
+                <w:rFonts w:ascii="Arial" w:hAnsi="Arial" w:cs="Arial"/>
+                <w:sz w:val="24"/>
+                <w:szCs w:val="24"/>
+              </w:rPr>
+            </w:pPr>
+            <w:r>
+              <w:rPr>
+                <w:rFonts w:ascii="Arial" w:hAnsi="Arial" w:cs="Arial"/>
+                <w:b/>
+                <w:bCs/>
+                <w:sz w:val="24"/>
+                <w:szCs w:val="24"/>
+              </w:rPr>
+              <w:t xml:space="preserve">Smart Notifications </w:t>
+            </w:r>
+            <w:r>
+              <w:rPr>
+                <w:rFonts w:ascii="Arial" w:hAnsi="Arial" w:cs="Arial"/>
+                <w:sz w:val="24"/>
+                <w:szCs w:val="24"/>
+              </w:rPr>
+              <w:t>– Users receive alerts/reminders about foods approaching its expiry date</w:t>
+            </w:r>
+            <w:r>
+              <w:rPr>
+                <w:rFonts w:ascii="Arial" w:hAnsi="Arial" w:cs="Arial"/>
+                <w:sz w:val="24"/>
+                <w:szCs w:val="24"/>
+              </w:rPr>
+              <w:t>.</w:t>
+            </w:r>
+          </w:p>
+          <w:p>
+            <w:pPr>
+              <w:pStyle w:val="ListParagraph"/>
+              <w:rPr>
+                <w:rFonts w:ascii="Arial" w:hAnsi="Arial" w:cs="Arial"/>
+                <w:b/>
+                <w:bCs/>
+                <w:sz w:val="24"/>
+                <w:szCs w:val="24"/>
+              </w:rPr>
+            </w:pPr>
+          </w:p>
+          <w:p>
+            <w:pPr>
+              <w:pStyle w:val="ListParagraph"/>
+              <w:numPr>
+                <w:ilvl w:val="0"/>
+                <w:numId w:val="5"/>
+              </w:numPr>
+              <w:spacing w:line="360" w:lineRule="atLeast"/>
+              <w:rPr>
+                <w:rFonts w:ascii="Arial" w:hAnsi="Arial" w:cs="Arial"/>
+                <w:sz w:val="24"/>
+                <w:szCs w:val="24"/>
+              </w:rPr>
+            </w:pPr>
+            <w:r>
+              <w:rPr>
+                <w:rFonts w:ascii="Arial" w:hAnsi="Arial" w:cs="Arial"/>
+                <w:b/>
+                <w:bCs/>
+                <w:sz w:val="24"/>
+                <w:szCs w:val="24"/>
+              </w:rPr>
+              <w:t xml:space="preserve">Recipe Recommendations </w:t>
+            </w:r>
+            <w:r>
+              <w:rPr>
+                <w:rFonts w:ascii="Arial" w:hAnsi="Arial" w:cs="Arial"/>
+                <w:sz w:val="24"/>
+                <w:szCs w:val="24"/>
+              </w:rPr>
+              <w:t xml:space="preserve">– The application will recommend recipes based on the </w:t>
+            </w:r>
+            <w:r>
+              <w:rPr>
+                <w:rFonts w:ascii="Arial" w:hAnsi="Arial" w:cs="Arial"/>
+                <w:sz w:val="24"/>
+                <w:szCs w:val="24"/>
+              </w:rPr>
+              <w:t>available ingredients, prioritising food that is likely to expire soon</w:t>
+            </w:r>
+            <w:r>
+              <w:rPr>
+                <w:rFonts w:ascii="Arial" w:hAnsi="Arial" w:cs="Arial"/>
+                <w:b/>
+                <w:bCs/>
+                <w:sz w:val="24"/>
+                <w:szCs w:val="24"/>
+              </w:rPr>
+              <w:t>.</w:t>
+            </w:r>
+            <w:r>
+              <w:rPr>
+                <w:rFonts w:ascii="Arial" w:hAnsi="Arial" w:cs="Arial"/>
+                <w:b/>
+                <w:bCs/>
+                <w:sz w:val="24"/>
+                <w:szCs w:val="24"/>
+              </w:rPr>
+              <w:t xml:space="preserve"> </w:t>
+            </w:r>
+          </w:p>
+          <w:p>
+            <w:pPr>
+              <w:pStyle w:val="ListParagraph"/>
+              <w:rPr>
+                <w:rFonts w:ascii="Arial" w:hAnsi="Arial" w:cs="Arial"/>
+                <w:sz w:val="24"/>
+                <w:szCs w:val="24"/>
+              </w:rPr>
+            </w:pPr>
+          </w:p>
+          <w:p>
+            <w:pPr>
+              <w:pStyle w:val="ListParagraph"/>
+              <w:numPr>
+                <w:ilvl w:val="0"/>
+                <w:numId w:val="5"/>
+              </w:numPr>
+              <w:spacing w:line="360" w:lineRule="atLeast"/>
+              <w:rPr>
+                <w:rFonts w:ascii="Arial" w:hAnsi="Arial" w:cs="Arial"/>
+                <w:sz w:val="24"/>
+                <w:szCs w:val="24"/>
+              </w:rPr>
+            </w:pPr>
+            <w:r>
+              <w:rPr>
+                <w:rFonts w:ascii="Arial" w:hAnsi="Arial" w:cs="Arial"/>
+                <w:b/>
+                <w:bCs/>
+                <w:sz w:val="24"/>
+                <w:szCs w:val="24"/>
+              </w:rPr>
+              <w:t xml:space="preserve">Food Waste Tracking </w:t>
+            </w:r>
+            <w:r>
+              <w:rPr>
+                <w:rFonts w:ascii="Arial" w:hAnsi="Arial" w:cs="Arial"/>
+                <w:sz w:val="24"/>
+                <w:szCs w:val="24"/>
+              </w:rPr>
+              <w:t>– Users can record food they have discarded, including relevant details such as the item and the reason for disposal.</w:t>
+            </w:r>
+          </w:p>
+          <w:p>
+            <w:pPr>
+              <w:pStyle w:val="ListParagraph"/>
+              <w:rPr>
+                <w:rFonts w:ascii="Arial" w:hAnsi="Arial" w:cs="Arial"/>
+                <w:sz w:val="24"/>
+                <w:szCs w:val="24"/>
+              </w:rPr>
+            </w:pPr>
+          </w:p>
+          <w:p>
+            <w:pPr>
+              <w:pStyle w:val="ListParagraph"/>
+              <w:numPr>
+                <w:ilvl w:val="0"/>
+                <w:numId w:val="5"/>
+              </w:numPr>
+              <w:spacing w:line="360" w:lineRule="atLeast"/>
+              <w:rPr>
+                <w:rFonts w:ascii="Arial" w:hAnsi="Arial" w:cs="Arial"/>
+                <w:sz w:val="24"/>
+                <w:szCs w:val="24"/>
+              </w:rPr>
+            </w:pPr>
+            <w:r>
+              <w:rPr>
+                <w:rFonts w:ascii="Arial" w:hAnsi="Arial" w:cs="Arial"/>
+                <w:b/>
+                <w:bCs/>
+                <w:sz w:val="24"/>
+                <w:szCs w:val="24"/>
+              </w:rPr>
+              <w:t>Waste Analysis and Dashboard</w:t>
+            </w:r>
+            <w:r>
+              <w:rPr>
+                <w:rFonts w:ascii="Arial" w:hAnsi="Arial" w:cs="Arial"/>
+                <w:sz w:val="24"/>
+                <w:szCs w:val="24"/>
+              </w:rPr>
+              <w:t xml:space="preserve"> – Users can view statistics and trends relating to their food usage and waste.</w:t>
+            </w:r>
+          </w:p>
+          <w:p>
+            <w:pPr>
+              <w:pStyle w:val="ListParagraph"/>
+              <w:rPr>
+                <w:rFonts w:ascii="Arial" w:hAnsi="Arial" w:cs="Arial"/>
+                <w:sz w:val="24"/>
+                <w:szCs w:val="24"/>
+              </w:rPr>
+            </w:pPr>
+          </w:p>
+          <w:p>
+            <w:pPr>
+              <w:pStyle w:val="ListParagraph"/>
+              <w:numPr>
+                <w:ilvl w:val="0"/>
+                <w:numId w:val="5"/>
+              </w:numPr>
+              <w:spacing w:line="360" w:lineRule="atLeast"/>
+              <w:rPr>
+                <w:rFonts w:ascii="Arial" w:hAnsi="Arial" w:cs="Arial"/>
+                <w:sz w:val="24"/>
+                <w:szCs w:val="24"/>
+              </w:rPr>
+            </w:pPr>
+            <w:r>
+              <w:rPr>
+                <w:rFonts w:ascii="Arial" w:hAnsi="Arial" w:cs="Arial"/>
+                <w:b/>
+                <w:bCs/>
+                <w:sz w:val="24"/>
+                <w:szCs w:val="24"/>
+              </w:rPr>
+              <w:t>AI Functionality</w:t>
+            </w:r>
+            <w:r>
+              <w:rPr>
+                <w:rFonts w:ascii="Arial" w:hAnsi="Arial" w:cs="Arial"/>
+                <w:sz w:val="24"/>
+                <w:szCs w:val="24"/>
+              </w:rPr>
+              <w:t xml:space="preserve"> – Ai can assist with food recognition from images and if foods are approaching expiry generate suitable recipes.</w:t>
+            </w:r>
+          </w:p>
+          <w:p>
+            <w:pPr>
+              <w:spacing w:line="360" w:lineRule="atLeast"/>
+              <w:rPr>
+                <w:rFonts w:ascii="Arial" w:hAnsi="Arial" w:cs="Arial"/>
+                <w:sz w:val="24"/>
+                <w:szCs w:val="24"/>
+              </w:rPr>
+            </w:pPr>
           </w:p>
         </w:tc>
       </w:tr>
@@ -1316,18 +2518,107 @@
           <w:rFonts w:ascii="Arial" w:hAnsi="Arial" w:cs="Arial"/>
           <w:b/>
           <w:bCs/>
-          <w:sz w:val="24"/>
-          <w:szCs w:val="24"/>
-        </w:rPr>
-      </w:pPr>
-      <w:r>
-        <w:rPr>
-          <w:rFonts w:ascii="Arial" w:hAnsi="Arial" w:cs="Arial"/>
-          <w:b/>
-          <w:bCs/>
-          <w:sz w:val="24"/>
-          <w:szCs w:val="24"/>
-        </w:rPr>
+        </w:rPr>
+      </w:pPr>
+    </w:p>
+    <w:p>
+      <w:pPr>
+        <w:spacing w:line="360" w:lineRule="atLeast"/>
+        <w:ind w:left="720" w:hanging="720"/>
+        <w:rPr>
+          <w:rFonts w:ascii="Arial" w:hAnsi="Arial" w:cs="Arial"/>
+          <w:b/>
+          <w:bCs/>
+        </w:rPr>
+      </w:pPr>
+    </w:p>
+    <w:p>
+      <w:pPr>
+        <w:spacing w:line="360" w:lineRule="atLeast"/>
+        <w:ind w:left="720" w:hanging="720"/>
+        <w:rPr>
+          <w:rFonts w:ascii="Arial" w:hAnsi="Arial" w:cs="Arial"/>
+          <w:b/>
+          <w:bCs/>
+        </w:rPr>
+      </w:pPr>
+    </w:p>
+    <w:p>
+      <w:pPr>
+        <w:spacing w:line="360" w:lineRule="atLeast"/>
+        <w:ind w:left="720" w:hanging="720"/>
+        <w:rPr>
+          <w:rFonts w:ascii="Arial" w:hAnsi="Arial" w:cs="Arial"/>
+          <w:b/>
+          <w:bCs/>
+        </w:rPr>
+      </w:pPr>
+    </w:p>
+    <w:p>
+      <w:pPr>
+        <w:spacing w:line="360" w:lineRule="atLeast"/>
+        <w:ind w:left="720" w:hanging="720"/>
+        <w:rPr>
+          <w:rFonts w:ascii="Arial" w:hAnsi="Arial" w:cs="Arial"/>
+          <w:b/>
+          <w:bCs/>
+        </w:rPr>
+      </w:pPr>
+    </w:p>
+    <w:p>
+      <w:pPr>
+        <w:spacing w:line="360" w:lineRule="atLeast"/>
+        <w:ind w:left="720" w:hanging="720"/>
+        <w:rPr>
+          <w:rFonts w:ascii="Arial" w:hAnsi="Arial" w:cs="Arial"/>
+          <w:b/>
+          <w:bCs/>
+        </w:rPr>
+      </w:pPr>
+    </w:p>
+    <w:p>
+      <w:pPr>
+        <w:spacing w:line="360" w:lineRule="atLeast"/>
+        <w:ind w:left="720" w:hanging="720"/>
+        <w:rPr>
+          <w:rFonts w:ascii="Arial" w:hAnsi="Arial" w:cs="Arial"/>
+          <w:b/>
+          <w:bCs/>
+        </w:rPr>
+      </w:pPr>
+    </w:p>
+    <w:p>
+      <w:pPr>
+        <w:spacing w:line="360" w:lineRule="atLeast"/>
+        <w:ind w:left="720" w:hanging="720"/>
+        <w:rPr>
+          <w:rFonts w:ascii="Arial" w:hAnsi="Arial" w:cs="Arial"/>
+          <w:b/>
+          <w:bCs/>
+        </w:rPr>
+      </w:pPr>
+    </w:p>
+    <w:p>
+      <w:pPr>
+        <w:spacing w:line="360" w:lineRule="atLeast"/>
+        <w:ind w:left="720" w:hanging="720"/>
+        <w:rPr>
+          <w:rFonts w:ascii="Arial" w:hAnsi="Arial" w:cs="Arial"/>
+          <w:b/>
+          <w:bCs/>
+          <w:sz w:val="24"/>
+          <w:szCs w:val="24"/>
+        </w:rPr>
+      </w:pPr>
+      <w:r>
+        <w:rPr>
+          <w:rFonts w:ascii="Arial" w:hAnsi="Arial" w:cs="Arial"/>
+          <w:b/>
+          <w:bCs/>
+          <w:sz w:val="24"/>
+          <w:szCs w:val="24"/>
+        </w:rPr>
+        <w:lastRenderedPageBreak/>
         <w:t>4</w:t>
       </w:r>
       <w:r>
@@ -2555,26 +3846,274 @@
           </w:tcPr>
           <w:p>
             <w:pPr>
-              <w:spacing w:line="360" w:lineRule="atLeast"/>
-              <w:rPr>
-                <w:rFonts w:ascii="Arial" w:hAnsi="Arial" w:cs="Arial"/>
-                <w:i/>
-                <w:iCs/>
-                <w:sz w:val="24"/>
-                <w:szCs w:val="24"/>
-              </w:rPr>
-            </w:pPr>
-            <w:r>
-              <w:rPr>
-                <w:rFonts w:ascii="Arial" w:hAnsi="Arial" w:cs="Arial"/>
-                <w:i/>
-                <w:iCs/>
-                <w:sz w:val="24"/>
-                <w:szCs w:val="24"/>
-              </w:rPr>
-              <w:t>References should be completed in Harvard UL Format.</w:t>
-            </w:r>
-          </w:p>
+              <w:ind w:hanging="480"/>
+            </w:pPr>
+            <w:r>
+              <w:rPr>
+                <w:rFonts w:ascii="Arial" w:hAnsi="Arial" w:cs="Arial"/>
+                <w:i/>
+                <w:iCs/>
+                <w:sz w:val="24"/>
+                <w:szCs w:val="24"/>
+              </w:rPr>
+              <w:t>Re</w:t>
+            </w:r>
+            <w:r>
+              <w:rPr>
+                <w:rFonts w:ascii="Arial" w:hAnsi="Arial" w:cs="Arial"/>
+                <w:i/>
+                <w:iCs/>
+                <w:sz w:val="24"/>
+                <w:szCs w:val="24"/>
+              </w:rPr>
+              <w:t>ferences should be completed in Harvard UL Format.</w:t>
+            </w:r>
+            <w:r>
+              <w:t xml:space="preserve"> </w:t>
+            </w:r>
+          </w:p>
+          <w:p>
+            <w:pPr>
+              <w:rPr>
+                <w:rFonts w:ascii="Times New Roman" w:hAnsi="Times New Roman" w:cs="Times New Roman"/>
+                <w:sz w:val="24"/>
+                <w:szCs w:val="24"/>
+                <w:lang w:eastAsia="en-IE"/>
+              </w:rPr>
+            </w:pPr>
+          </w:p>
+          <w:p>
+            <w:pPr>
+              <w:rPr>
+                <w:rFonts w:ascii="Times New Roman" w:hAnsi="Times New Roman" w:cs="Times New Roman"/>
+                <w:sz w:val="24"/>
+                <w:szCs w:val="24"/>
+                <w:lang w:eastAsia="en-IE"/>
+              </w:rPr>
+            </w:pPr>
+          </w:p>
+          <w:p>
+            <w:pPr>
+              <w:rPr>
+                <w:rFonts w:ascii="Times New Roman" w:eastAsia="Times New Roman" w:hAnsi="Times New Roman" w:cs="Times New Roman"/>
+                <w:sz w:val="24"/>
+                <w:szCs w:val="24"/>
+                <w:lang w:eastAsia="en-IE"/>
+              </w:rPr>
+            </w:pPr>
+            <w:r>
+              <w:rPr>
+                <w:rFonts w:ascii="Times New Roman" w:eastAsia="Times New Roman" w:hAnsi="Times New Roman" w:cs="Times New Roman"/>
+                <w:sz w:val="24"/>
+                <w:szCs w:val="24"/>
+                <w:lang w:eastAsia="en-IE"/>
+              </w:rPr>
+              <w:t xml:space="preserve">Haldar, </w:t>
+            </w:r>
+            <w:proofErr w:type="spellStart"/>
+            <w:r>
+              <w:rPr>
+                <w:rFonts w:ascii="Times New Roman" w:eastAsia="Times New Roman" w:hAnsi="Times New Roman" w:cs="Times New Roman"/>
+                <w:sz w:val="24"/>
+                <w:szCs w:val="24"/>
+                <w:lang w:eastAsia="en-IE"/>
+              </w:rPr>
+              <w:t>Dibyajyoti</w:t>
+            </w:r>
+            <w:proofErr w:type="spellEnd"/>
+            <w:r>
+              <w:rPr>
+                <w:rFonts w:ascii="Times New Roman" w:eastAsia="Times New Roman" w:hAnsi="Times New Roman" w:cs="Times New Roman"/>
+                <w:sz w:val="24"/>
+                <w:szCs w:val="24"/>
+                <w:lang w:eastAsia="en-IE"/>
+              </w:rPr>
+              <w:t xml:space="preserve">, Asma Musfira Shabbirahmed, Reeta Rani Singhania, et al. ‘Understanding the Management of Household Food Waste and Its Engineering for Sustainable </w:t>
+            </w:r>
+            <w:proofErr w:type="spellStart"/>
+            <w:r>
+              <w:rPr>
+                <w:rFonts w:ascii="Times New Roman" w:eastAsia="Times New Roman" w:hAnsi="Times New Roman" w:cs="Times New Roman"/>
+                <w:sz w:val="24"/>
+                <w:szCs w:val="24"/>
+                <w:lang w:eastAsia="en-IE"/>
+              </w:rPr>
+              <w:t>Valorization</w:t>
+            </w:r>
+            <w:proofErr w:type="spellEnd"/>
+            <w:r>
+              <w:rPr>
+                <w:rFonts w:ascii="Times New Roman" w:eastAsia="Times New Roman" w:hAnsi="Times New Roman" w:cs="Times New Roman"/>
+                <w:sz w:val="24"/>
+                <w:szCs w:val="24"/>
+                <w:lang w:eastAsia="en-IE"/>
+              </w:rPr>
+              <w:t xml:space="preserve">- A State-of-the-Art Review’. </w:t>
+            </w:r>
+            <w:r>
+              <w:rPr>
+                <w:rFonts w:ascii="Times New Roman" w:eastAsia="Times New Roman" w:hAnsi="Times New Roman" w:cs="Times New Roman"/>
+                <w:i/>
+                <w:iCs/>
+                <w:sz w:val="24"/>
+                <w:szCs w:val="24"/>
+                <w:lang w:eastAsia="en-IE"/>
+              </w:rPr>
+              <w:t>Bioresource Technology</w:t>
+            </w:r>
+            <w:r>
+              <w:rPr>
+                <w:rFonts w:ascii="Times New Roman" w:eastAsia="Times New Roman" w:hAnsi="Times New Roman" w:cs="Times New Roman"/>
+                <w:sz w:val="24"/>
+                <w:szCs w:val="24"/>
+                <w:lang w:eastAsia="en-IE"/>
+              </w:rPr>
+              <w:t xml:space="preserve"> 358 (August 2022): 127390. </w:t>
+            </w:r>
+            <w:hyperlink r:id="rId9" w:history="1">
+              <w:r>
+                <w:rPr>
+                  <w:rFonts w:ascii="Times New Roman" w:eastAsia="Times New Roman" w:hAnsi="Times New Roman" w:cs="Times New Roman"/>
+                  <w:color w:val="0000FF"/>
+                  <w:sz w:val="24"/>
+                  <w:szCs w:val="24"/>
+                  <w:u w:val="single"/>
+                  <w:lang w:eastAsia="en-IE"/>
+                </w:rPr>
+                <w:t>https://doi.org/10.1016/j.biortech.2022.127390</w:t>
+              </w:r>
+            </w:hyperlink>
+            <w:r>
+              <w:rPr>
+                <w:rFonts w:ascii="Times New Roman" w:eastAsia="Times New Roman" w:hAnsi="Times New Roman" w:cs="Times New Roman"/>
+                <w:sz w:val="24"/>
+                <w:szCs w:val="24"/>
+                <w:lang w:eastAsia="en-IE"/>
+              </w:rPr>
+              <w:t>.</w:t>
+            </w:r>
+          </w:p>
+          <w:p>
+            <w:pPr>
+              <w:rPr>
+                <w:rFonts w:ascii="Times New Roman" w:eastAsia="Times New Roman" w:hAnsi="Times New Roman" w:cs="Times New Roman"/>
+                <w:sz w:val="24"/>
+                <w:szCs w:val="24"/>
+                <w:lang w:eastAsia="en-IE"/>
+              </w:rPr>
+            </w:pPr>
+            <w:r>
+              <w:rPr>
+                <w:rFonts w:ascii="Times New Roman" w:eastAsia="Times New Roman" w:hAnsi="Times New Roman" w:cs="Times New Roman"/>
+                <w:sz w:val="24"/>
+                <w:szCs w:val="24"/>
+                <w:lang w:eastAsia="en-IE"/>
+              </w:rPr>
+              <w:t xml:space="preserve"> </w:t>
+            </w:r>
+          </w:p>
+          <w:p>
+            <w:pPr>
+              <w:ind w:hanging="480"/>
+              <w:rPr>
+                <w:rFonts w:ascii="Times New Roman" w:eastAsia="Times New Roman" w:hAnsi="Times New Roman" w:cs="Times New Roman"/>
+                <w:sz w:val="24"/>
+                <w:szCs w:val="24"/>
+                <w:lang w:eastAsia="en-IE"/>
+              </w:rPr>
+            </w:pPr>
+            <w:r>
+              <w:rPr>
+                <w:rFonts w:ascii="Times New Roman" w:eastAsia="Times New Roman" w:hAnsi="Times New Roman" w:cs="Times New Roman"/>
+                <w:sz w:val="24"/>
+                <w:szCs w:val="24"/>
+                <w:lang w:eastAsia="en-IE"/>
+              </w:rPr>
+              <w:t>Sc</w:t>
+            </w:r>
+            <w:r>
+              <w:rPr>
+                <w:rFonts w:ascii="Times New Roman" w:eastAsia="Times New Roman" w:hAnsi="Times New Roman" w:cs="Times New Roman"/>
+                <w:sz w:val="24"/>
+                <w:szCs w:val="24"/>
+                <w:lang w:eastAsia="en-IE"/>
+              </w:rPr>
+              <w:t xml:space="preserve">    Sc</w:t>
+            </w:r>
+            <w:r>
+              <w:rPr>
+                <w:rFonts w:ascii="Times New Roman" w:eastAsia="Times New Roman" w:hAnsi="Times New Roman" w:cs="Times New Roman"/>
+                <w:sz w:val="24"/>
+                <w:szCs w:val="24"/>
+                <w:lang w:eastAsia="en-IE"/>
+              </w:rPr>
+              <w:t xml:space="preserve">hanes, Karin, Karin Dobernig, and Burcu </w:t>
+            </w:r>
+            <w:proofErr w:type="spellStart"/>
+            <w:r>
+              <w:rPr>
+                <w:rFonts w:ascii="Times New Roman" w:eastAsia="Times New Roman" w:hAnsi="Times New Roman" w:cs="Times New Roman"/>
+                <w:sz w:val="24"/>
+                <w:szCs w:val="24"/>
+                <w:lang w:eastAsia="en-IE"/>
+              </w:rPr>
+              <w:t>Gözet</w:t>
+            </w:r>
+            <w:proofErr w:type="spellEnd"/>
+            <w:r>
+              <w:rPr>
+                <w:rFonts w:ascii="Times New Roman" w:eastAsia="Times New Roman" w:hAnsi="Times New Roman" w:cs="Times New Roman"/>
+                <w:sz w:val="24"/>
+                <w:szCs w:val="24"/>
+                <w:lang w:eastAsia="en-IE"/>
+              </w:rPr>
+              <w:t xml:space="preserve">. ‘Food Waste Matters - A Systematic Review of Household Food Waste Practices and Their Policy Implications’. </w:t>
+            </w:r>
+            <w:r>
+              <w:rPr>
+                <w:rFonts w:ascii="Times New Roman" w:eastAsia="Times New Roman" w:hAnsi="Times New Roman" w:cs="Times New Roman"/>
+                <w:i/>
+                <w:iCs/>
+                <w:sz w:val="24"/>
+                <w:szCs w:val="24"/>
+                <w:lang w:eastAsia="en-IE"/>
+              </w:rPr>
+              <w:t>Journal of Cleaner Production</w:t>
+            </w:r>
+            <w:r>
+              <w:rPr>
+                <w:rFonts w:ascii="Times New Roman" w:eastAsia="Times New Roman" w:hAnsi="Times New Roman" w:cs="Times New Roman"/>
+                <w:sz w:val="24"/>
+                <w:szCs w:val="24"/>
+                <w:lang w:eastAsia="en-IE"/>
+              </w:rPr>
+              <w:t xml:space="preserve"> 182 (May 2018): 978–91. </w:t>
+            </w:r>
+            <w:hyperlink r:id="rId10" w:history="1">
+              <w:r>
+                <w:rPr>
+                  <w:rFonts w:ascii="Times New Roman" w:eastAsia="Times New Roman" w:hAnsi="Times New Roman" w:cs="Times New Roman"/>
+                  <w:color w:val="0000FF"/>
+                  <w:sz w:val="24"/>
+                  <w:szCs w:val="24"/>
+                  <w:u w:val="single"/>
+                  <w:lang w:eastAsia="en-IE"/>
+                </w:rPr>
+                <w:t>https://doi.org/10.1016/j.jclepro.2018.02.030</w:t>
+              </w:r>
+            </w:hyperlink>
+            <w:r>
+              <w:rPr>
+                <w:rFonts w:ascii="Times New Roman" w:eastAsia="Times New Roman" w:hAnsi="Times New Roman" w:cs="Times New Roman"/>
+                <w:sz w:val="24"/>
+                <w:szCs w:val="24"/>
+                <w:lang w:eastAsia="en-IE"/>
+              </w:rPr>
+              <w:t>.</w:t>
+            </w:r>
+          </w:p>
+          <w:p/>
+          <w:p/>
           <w:p>
             <w:pPr>
               <w:spacing w:line="360" w:lineRule="atLeast"/>
@@ -2640,7 +4179,7 @@
     </w:tbl>
     <w:p/>
     <w:sectPr>
-      <w:footerReference w:type="default" r:id="rId8"/>
+      <w:footerReference w:type="default" r:id="rId11"/>
       <w:pgSz w:w="11906" w:h="16838"/>
       <w:pgMar w:top="1361" w:right="1440" w:bottom="1440" w:left="1361" w:header="709" w:footer="709" w:gutter="0"/>
       <w:cols w:space="708"/>
@@ -3041,6 +4580,95 @@
     </w:lvl>
   </w:abstractNum>
   <w:abstractNum w:abstractNumId="3" w15:restartNumberingAfterBreak="0">
+    <w:nsid w:val="6ED374E3"/>
+    <w:multiLevelType w:val="hybridMultilevel"/>
+    <w:tmpl w:val="10D64434"/>
+    <w:lvl w:ilvl="0" w:tplc="18090011">
+      <w:start w:val="1"/>
+      <w:numFmt w:val="decimal"/>
+      <w:lvlText w:val="%1)"/>
+      <w:lvlJc w:val="left"/>
+      <w:pPr>
+        <w:ind w:left="720" w:hanging="360"/>
+      </w:pPr>
+      <w:rPr>
+        <w:rFonts w:hint="default"/>
+      </w:rPr>
+    </w:lvl>
+    <w:lvl w:ilvl="1" w:tplc="18090019" w:tentative="1">
+      <w:start w:val="1"/>
+      <w:numFmt w:val="lowerLetter"/>
+      <w:lvlText w:val="%2."/>
+      <w:lvlJc w:val="left"/>
+      <w:pPr>
+        <w:ind w:left="1440" w:hanging="360"/>
+      </w:pPr>
+    </w:lvl>
+    <w:lvl w:ilvl="2" w:tplc="1809001B" w:tentative="1">
+      <w:start w:val="1"/>
+      <w:numFmt w:val="lowerRoman"/>
+      <w:lvlText w:val="%3."/>
+      <w:lvlJc w:val="right"/>
+      <w:pPr>
+        <w:ind w:left="2160" w:hanging="180"/>
+      </w:pPr>
+    </w:lvl>
+    <w:lvl w:ilvl="3" w:tplc="1809000F" w:tentative="1">
+      <w:start w:val="1"/>
+      <w:numFmt w:val="decimal"/>
+      <w:lvlText w:val="%4."/>
+      <w:lvlJc w:val="left"/>
+      <w:pPr>
+        <w:ind w:left="2880" w:hanging="360"/>
+      </w:pPr>
+    </w:lvl>
+    <w:lvl w:ilvl="4" w:tplc="18090019" w:tentative="1">
+      <w:start w:val="1"/>
+      <w:numFmt w:val="lowerLetter"/>
+      <w:lvlText w:val="%5."/>
+      <w:lvlJc w:val="left"/>
+      <w:pPr>
+        <w:ind w:left="3600" w:hanging="360"/>
+      </w:pPr>
+    </w:lvl>
+    <w:lvl w:ilvl="5" w:tplc="1809001B" w:tentative="1">
+      <w:start w:val="1"/>
+      <w:numFmt w:val="lowerRoman"/>
+      <w:lvlText w:val="%6."/>
+      <w:lvlJc w:val="right"/>
+      <w:pPr>
+        <w:ind w:left="4320" w:hanging="180"/>
+      </w:pPr>
+    </w:lvl>
+    <w:lvl w:ilvl="6" w:tplc="1809000F" w:tentative="1">
+      <w:start w:val="1"/>
+      <w:numFmt w:val="decimal"/>
+      <w:lvlText w:val="%7."/>
+      <w:lvlJc w:val="left"/>
+      <w:pPr>
+        <w:ind w:left="5040" w:hanging="360"/>
+      </w:pPr>
+    </w:lvl>
+    <w:lvl w:ilvl="7" w:tplc="18090019" w:tentative="1">
+      <w:start w:val="1"/>
+      <w:numFmt w:val="lowerLetter"/>
+      <w:lvlText w:val="%8."/>
+      <w:lvlJc w:val="left"/>
+      <w:pPr>
+        <w:ind w:left="5760" w:hanging="360"/>
+      </w:pPr>
+    </w:lvl>
+    <w:lvl w:ilvl="8" w:tplc="1809001B" w:tentative="1">
+      <w:start w:val="1"/>
+      <w:numFmt w:val="lowerRoman"/>
+      <w:lvlText w:val="%9."/>
+      <w:lvlJc w:val="right"/>
+      <w:pPr>
+        <w:ind w:left="6480" w:hanging="180"/>
+      </w:pPr>
+    </w:lvl>
+  </w:abstractNum>
+  <w:abstractNum w:abstractNumId="4" w15:restartNumberingAfterBreak="0">
     <w:nsid w:val="73427328"/>
     <w:multiLevelType w:val="hybridMultilevel"/>
     <w:tmpl w:val="198C7220"/>
@@ -3157,13 +4785,16 @@
     <w:abstractNumId w:val="0"/>
   </w:num>
   <w:num w:numId="2" w16cid:durableId="883904202">
-    <w:abstractNumId w:val="3"/>
+    <w:abstractNumId w:val="4"/>
   </w:num>
   <w:num w:numId="3" w16cid:durableId="234435355">
     <w:abstractNumId w:val="2"/>
   </w:num>
   <w:num w:numId="4" w16cid:durableId="691999202">
     <w:abstractNumId w:val="1"/>
+  </w:num>
+  <w:num w:numId="5" w16cid:durableId="466552741">
+    <w:abstractNumId w:val="3"/>
   </w:num>
 </w:numbering>
 </file>
@@ -3566,6 +5197,7 @@
   <w:style w:type="paragraph" w:default="1" w:styleId="Normal">
     <w:name w:val="Normal"/>
     <w:qFormat/>
+    <w:rsid w:val="00A56409"/>
   </w:style>
   <w:style w:type="paragraph" w:styleId="Heading1">
     <w:name w:val="heading 1"/>
@@ -3591,7 +5223,6 @@
   <w:style w:type="character" w:default="1" w:styleId="DefaultParagraphFont">
     <w:name w:val="Default Paragraph Font"/>
     <w:uiPriority w:val="1"/>
-    <w:semiHidden/>
     <w:unhideWhenUsed/>
   </w:style>
   <w:style w:type="table" w:default="1" w:styleId="TableNormal">
@@ -3795,6 +5426,18 @@
       <w:ind w:left="720"/>
       <w:contextualSpacing/>
     </w:pPr>
+  </w:style>
+  <w:style w:type="character" w:styleId="Hyperlink">
+    <w:name w:val="Hyperlink"/>
+    <w:basedOn w:val="DefaultParagraphFont"/>
+    <w:uiPriority w:val="99"/>
+    <w:semiHidden/>
+    <w:unhideWhenUsed/>
+    <w:rsid w:val="00827A32"/>
+    <w:rPr>
+      <w:color w:val="0000FF"/>
+      <w:u w:val="single"/>
+    </w:rPr>
   </w:style>
 </w:styles>
 </file>

</xml_diff>